<commit_message>
Fix single-result scraping, hide internal params, reposition recording indicator
- replayEngine: falls back to a single-card scrape when a search genuinely
  returns just one match (the grouping heuristic needs 2+ siblings to
  recognize a list); detects prices shown via a "price"-classed element
  when a site renders the currency mark as an icon rather than text
- paramDetect: "route" and "description" (OpenCart-style internal routing/
  search-scope params with no real UI control behind them) no longer
  surface as fake changeable fields
- RunResultCard: shows "No results found for this search query" when an
  auto-scraped search comes back empty, instead of a blank area
- extension: recording indicator moves to the bottom-right corner
- PRD: add Markdown copy (PRD_AutoMATE.md) alongside the Word doc, update
  both with the fixes above

Co-Authored-By: Claude Sonnet 5 <noreply@anthropic.com>
</commit_message>
<xml_diff>
--- a/PRD_AutoMATE.docx
+++ b/PRD_AutoMATE.docx
@@ -831,7 +831,20 @@
         <w:spacing w:after="80"/>
       </w:pPr>
       <w:r>
-        <w:t xml:space="preserve">Friendly field names — cryptic technical field names are shown in plain English, and where a site bundles several filters into one raw value behind the scenes, that value is shown broken out in readable terms.</w:t>
+        <w:t xml:space="preserve">Friendly field names — cryptic technical field names are shown in plain English, and where a site bundles several filters into one raw value behind the scenes, that value is shown broken out in readable terms. Purely internal, technical parameters with no real user-facing control behind them (a site's internal routing target, a bare search-scope flag) are hidden entirely rather than shown as something to “change.”</w:t>
+      </w:r>
+    </w:p>
+    <w:p>
+      <w:pPr>
+        <w:pStyle w:val="ListParagraph"/>
+        <w:numPr>
+          <w:ilvl w:val="0"/>
+          <w:numId w:val="2"/>
+        </w:numPr>
+        <w:spacing w:after="80"/>
+      </w:pPr>
+      <w:r>
+        <w:t xml:space="preserve">Generic result scraping — a best-effort scrape recognizes a repeated list of result cards automatically; when a search genuinely returns just one match with no siblings to pattern-match against, a fallback still finds and shows that single card instead of silently displaying nothing. When a search legitimately returns nothing, the app says so plainly (“No results found for this search query”) instead of showing a blank area.</w:t>
       </w:r>
     </w:p>
     <w:p>
@@ -848,7 +861,7 @@
         <w:spacing w:after="160"/>
       </w:pPr>
       <w:r>
-        <w:t xml:space="preserve">The web app supports light, dark, and system-matched themes, chosen from the navbar and remembered between visits. The browser extension's popup automatically matches whichever theme is active in the web app, so the two never look out of sync.</w:t>
+        <w:t xml:space="preserve">The web app supports light, dark, and system-matched themes, chosen from the navbar and remembered between visits. The browser extension's popup automatically matches whichever theme is active in the web app, so the two never look out of sync. The in-page recording indicator sits in the bottom-right corner, out of the way of a page's own header and controls.</w:t>
       </w:r>
     </w:p>
     <w:p>

</xml_diff>